<commit_message>
Said to Turn in BEFORE (not after) taking the exam.  Forbade the MULTI-line PyCharm hints.
</commit_message>
<xml_diff>
--- a/202630/ExamInformation/Exam1/Exam1_AcademicIntegrity.docx
+++ b/202630/ExamInformation/Exam1/Exam1_AcademicIntegrity.docx
@@ -1,6 +1,6 @@
 
 <file path=word/document.xml><?xml version="1.0" encoding="utf-8"?>
-<w:document xmlns:wpc="http://schemas.microsoft.com/office/word/2010/wordprocessingCanvas" xmlns:cx="http://schemas.microsoft.com/office/drawing/2014/chartex" xmlns:cx1="http://schemas.microsoft.com/office/drawing/2015/9/8/chartex" xmlns:cx2="http://schemas.microsoft.com/office/drawing/2015/10/21/chartex" xmlns:cx3="http://schemas.microsoft.com/office/drawing/2016/5/9/chartex" xmlns:cx4="http://schemas.microsoft.com/office/drawing/2016/5/10/chartex" xmlns:cx5="http://schemas.microsoft.com/office/drawing/2016/5/11/chartex" xmlns:cx6="http://schemas.microsoft.com/office/drawing/2016/5/12/chartex" xmlns:cx7="http://schemas.microsoft.com/office/drawing/2016/5/13/chartex" xmlns:cx8="http://schemas.microsoft.com/office/drawing/2016/5/14/chartex" xmlns:mc="http://schemas.openxmlformats.org/markup-compatibility/2006" xmlns:aink="http://schemas.microsoft.com/office/drawing/2016/ink" xmlns:am3d="http://schemas.microsoft.com/office/drawing/2017/model3d" xmlns:o="urn:schemas-microsoft-com:office:office" xmlns:oel="http://schemas.microsoft.com/office/2019/extlst" xmlns:r="http://schemas.openxmlformats.org/officeDocument/2006/relationships" xmlns:m="http://schemas.openxmlformats.org/officeDocument/2006/math" xmlns:v="urn:schemas-microsoft-com:vml" xmlns:wp14="http://schemas.microsoft.com/office/word/2010/wordprocessingDrawing" xmlns:wp="http://schemas.openxmlformats.org/drawingml/2006/wordprocessingDrawing" xmlns:w10="urn:schemas-microsoft-com:office:word" xmlns:w="http://schemas.openxmlformats.org/wordprocessingml/2006/main" xmlns:w14="http://schemas.microsoft.com/office/word/2010/wordml" xmlns:w15="http://schemas.microsoft.com/office/word/2012/wordml" xmlns:w16cex="http://schemas.microsoft.com/office/word/2018/wordml/cex" xmlns:w16cid="http://schemas.microsoft.com/office/word/2016/wordml/cid" xmlns:w16="http://schemas.microsoft.com/office/word/2018/wordml" xmlns:w16du="http://schemas.microsoft.com/office/word/2023/wordml/word16du" xmlns:w16sdtdh="http://schemas.microsoft.com/office/word/2020/wordml/sdtdatahash" xmlns:w16se="http://schemas.microsoft.com/office/word/2015/wordml/symex" xmlns:wpg="http://schemas.microsoft.com/office/word/2010/wordprocessingGroup" xmlns:wpi="http://schemas.microsoft.com/office/word/2010/wordprocessingInk" xmlns:wne="http://schemas.microsoft.com/office/word/2006/wordml" xmlns:wps="http://schemas.microsoft.com/office/word/2010/wordprocessingShape" mc:Ignorable="w14 w15 w16se w16cid w16 w16cex w16sdtdh w16du wp14">
+<w:document xmlns:wpc="http://schemas.microsoft.com/office/word/2010/wordprocessingCanvas" xmlns:cx="http://schemas.microsoft.com/office/drawing/2014/chartex" xmlns:cx1="http://schemas.microsoft.com/office/drawing/2015/9/8/chartex" xmlns:cx2="http://schemas.microsoft.com/office/drawing/2015/10/21/chartex" xmlns:cx3="http://schemas.microsoft.com/office/drawing/2016/5/9/chartex" xmlns:cx4="http://schemas.microsoft.com/office/drawing/2016/5/10/chartex" xmlns:cx5="http://schemas.microsoft.com/office/drawing/2016/5/11/chartex" xmlns:cx6="http://schemas.microsoft.com/office/drawing/2016/5/12/chartex" xmlns:cx7="http://schemas.microsoft.com/office/drawing/2016/5/13/chartex" xmlns:cx8="http://schemas.microsoft.com/office/drawing/2016/5/14/chartex" xmlns:mc="http://schemas.openxmlformats.org/markup-compatibility/2006" xmlns:aink="http://schemas.microsoft.com/office/drawing/2016/ink" xmlns:am3d="http://schemas.microsoft.com/office/drawing/2017/model3d" xmlns:o="urn:schemas-microsoft-com:office:office" xmlns:oel="http://schemas.microsoft.com/office/2019/extlst" xmlns:r="http://schemas.openxmlformats.org/officeDocument/2006/relationships" xmlns:m="http://schemas.openxmlformats.org/officeDocument/2006/math" xmlns:v="urn:schemas-microsoft-com:vml" xmlns:wp14="http://schemas.microsoft.com/office/word/2010/wordprocessingDrawing" xmlns:wp="http://schemas.openxmlformats.org/drawingml/2006/wordprocessingDrawing" xmlns:w10="urn:schemas-microsoft-com:office:word" xmlns:w="http://schemas.openxmlformats.org/wordprocessingml/2006/main" xmlns:w14="http://schemas.microsoft.com/office/word/2010/wordml" xmlns:w15="http://schemas.microsoft.com/office/word/2012/wordml" xmlns:w16cex="http://schemas.microsoft.com/office/word/2018/wordml/cex" xmlns:w16cid="http://schemas.microsoft.com/office/word/2016/wordml/cid" xmlns:w16="http://schemas.microsoft.com/office/word/2018/wordml" xmlns:w16du="http://schemas.microsoft.com/office/word/2023/wordml/word16du" xmlns:w16sdtdh="http://schemas.microsoft.com/office/word/2020/wordml/sdtdatahash" xmlns:w16sdtfl="http://schemas.microsoft.com/office/word/2024/wordml/sdtformatlock" xmlns:w16se="http://schemas.microsoft.com/office/word/2015/wordml/symex" xmlns:wpg="http://schemas.microsoft.com/office/word/2010/wordprocessingGroup" xmlns:wpi="http://schemas.microsoft.com/office/word/2010/wordprocessingInk" xmlns:wne="http://schemas.microsoft.com/office/word/2006/wordml" xmlns:wps="http://schemas.microsoft.com/office/word/2010/wordprocessingShape" mc:Ignorable="w14 w15 w16se w16cid w16 w16cex w16sdtdh w16sdtfl w16du wp14">
   <w:body>
     <w:p>
       <w:pPr>
@@ -47,7 +47,21 @@
           <w:b/>
           <w:sz w:val="24"/>
         </w:rPr>
-        <w:t xml:space="preserve">Turn it in when you complete this </w:t>
+        <w:t xml:space="preserve">Turn it in </w:t>
+      </w:r>
+      <w:r>
+        <w:rPr>
+          <w:b/>
+          <w:sz w:val="24"/>
+        </w:rPr>
+        <w:t xml:space="preserve">before you start </w:t>
+      </w:r>
+      <w:r>
+        <w:rPr>
+          <w:b/>
+          <w:sz w:val="24"/>
+        </w:rPr>
+        <w:t xml:space="preserve">this </w:t>
       </w:r>
       <w:r>
         <w:rPr>
@@ -943,7 +957,23 @@
           <w:i/>
           <w:sz w:val="24"/>
         </w:rPr>
-        <w:t xml:space="preserve">, nor any Large Learning Model like ChatGPT, nor the AI Assistant paid add-on in PyCharm.  </w:t>
+        <w:t>, nor any Large Learning Model like ChatGPT, nor the AI Assistant paid add-on in PyCharm</w:t>
+      </w:r>
+      <w:r>
+        <w:rPr>
+          <w:b/>
+          <w:i/>
+          <w:sz w:val="24"/>
+        </w:rPr>
+        <w:t>, nor the MULTI-line auto-completion in PyCharm.</w:t>
+      </w:r>
+      <w:r>
+        <w:rPr>
+          <w:b/>
+          <w:i/>
+          <w:sz w:val="24"/>
+        </w:rPr>
+        <w:t xml:space="preserve">  </w:t>
       </w:r>
       <w:r>
         <w:rPr>
@@ -959,7 +989,7 @@
           <w:iCs/>
           <w:sz w:val="24"/>
         </w:rPr>
-        <w:t>PyCharm’s</w:t>
+        <w:t xml:space="preserve">its </w:t>
       </w:r>
       <w:r>
         <w:rPr>
@@ -967,7 +997,39 @@
           <w:iCs/>
           <w:sz w:val="24"/>
         </w:rPr>
-        <w:t xml:space="preserve"> built-in auto-completion hints.)</w:t>
+        <w:t xml:space="preserve">built-in </w:t>
+      </w:r>
+      <w:r>
+        <w:rPr>
+          <w:bCs/>
+          <w:iCs/>
+          <w:sz w:val="24"/>
+        </w:rPr>
+        <w:t>SING</w:t>
+      </w:r>
+      <w:r>
+        <w:rPr>
+          <w:bCs/>
+          <w:iCs/>
+          <w:sz w:val="24"/>
+        </w:rPr>
+        <w:t>LE</w:t>
+      </w:r>
+      <w:r>
+        <w:rPr>
+          <w:bCs/>
+          <w:iCs/>
+          <w:sz w:val="24"/>
+        </w:rPr>
+        <w:t xml:space="preserve">-line </w:t>
+      </w:r>
+      <w:r>
+        <w:rPr>
+          <w:bCs/>
+          <w:iCs/>
+          <w:sz w:val="24"/>
+        </w:rPr>
+        <w:t>auto-completion hints.)</w:t>
       </w:r>
     </w:p>
     <w:p>
@@ -1546,7 +1608,23 @@
           <w:i/>
           <w:sz w:val="24"/>
         </w:rPr>
-        <w:t xml:space="preserve">privately soon after the </w:t>
+        <w:t xml:space="preserve">privately </w:t>
+      </w:r>
+      <w:r>
+        <w:rPr>
+          <w:b/>
+          <w:i/>
+          <w:sz w:val="24"/>
+        </w:rPr>
+        <w:t xml:space="preserve">before I take </w:t>
+      </w:r>
+      <w:r>
+        <w:rPr>
+          <w:b/>
+          <w:i/>
+          <w:sz w:val="24"/>
+        </w:rPr>
+        <w:t xml:space="preserve">the </w:t>
       </w:r>
       <w:r>
         <w:rPr>
@@ -1580,23 +1658,47 @@
           <w:i/>
           <w:sz w:val="24"/>
         </w:rPr>
-        <w:t xml:space="preserve">Turn this in when you </w:t>
-      </w:r>
-      <w:r>
-        <w:rPr>
-          <w:b/>
-          <w:i/>
-          <w:sz w:val="24"/>
-        </w:rPr>
-        <w:t>are FINISHED taking</w:t>
-      </w:r>
-      <w:r>
-        <w:rPr>
-          <w:b/>
-          <w:i/>
-          <w:sz w:val="24"/>
-        </w:rPr>
-        <w:t xml:space="preserve"> the </w:t>
+        <w:t xml:space="preserve">Turn this in </w:t>
+      </w:r>
+      <w:r>
+        <w:rPr>
+          <w:b/>
+          <w:i/>
+          <w:sz w:val="24"/>
+        </w:rPr>
+        <w:t>before you START</w:t>
+      </w:r>
+      <w:r>
+        <w:rPr>
+          <w:b/>
+          <w:i/>
+          <w:sz w:val="24"/>
+        </w:rPr>
+        <w:t xml:space="preserve"> taking</w:t>
+      </w:r>
+      <w:r>
+        <w:rPr>
+          <w:b/>
+          <w:i/>
+          <w:sz w:val="24"/>
+        </w:rPr>
+        <w:t xml:space="preserve"> th</w:t>
+      </w:r>
+      <w:r>
+        <w:rPr>
+          <w:b/>
+          <w:i/>
+          <w:sz w:val="24"/>
+        </w:rPr>
+        <w:t>e</w:t>
+      </w:r>
+      <w:r>
+        <w:rPr>
+          <w:b/>
+          <w:i/>
+          <w:sz w:val="24"/>
+        </w:rPr>
+        <w:t xml:space="preserve"> </w:t>
       </w:r>
       <w:r>
         <w:rPr>
@@ -1727,7 +1829,7 @@
 </file>
 
 <file path=word/numbering.xml><?xml version="1.0" encoding="utf-8"?>
-<w:numbering xmlns:wpc="http://schemas.microsoft.com/office/word/2010/wordprocessingCanvas" xmlns:cx="http://schemas.microsoft.com/office/drawing/2014/chartex" xmlns:cx1="http://schemas.microsoft.com/office/drawing/2015/9/8/chartex" xmlns:cx2="http://schemas.microsoft.com/office/drawing/2015/10/21/chartex" xmlns:cx3="http://schemas.microsoft.com/office/drawing/2016/5/9/chartex" xmlns:cx4="http://schemas.microsoft.com/office/drawing/2016/5/10/chartex" xmlns:cx5="http://schemas.microsoft.com/office/drawing/2016/5/11/chartex" xmlns:cx6="http://schemas.microsoft.com/office/drawing/2016/5/12/chartex" xmlns:cx7="http://schemas.microsoft.com/office/drawing/2016/5/13/chartex" xmlns:cx8="http://schemas.microsoft.com/office/drawing/2016/5/14/chartex" xmlns:mc="http://schemas.openxmlformats.org/markup-compatibility/2006" xmlns:aink="http://schemas.microsoft.com/office/drawing/2016/ink" xmlns:am3d="http://schemas.microsoft.com/office/drawing/2017/model3d" xmlns:o="urn:schemas-microsoft-com:office:office" xmlns:oel="http://schemas.microsoft.com/office/2019/extlst" xmlns:r="http://schemas.openxmlformats.org/officeDocument/2006/relationships" xmlns:m="http://schemas.openxmlformats.org/officeDocument/2006/math" xmlns:v="urn:schemas-microsoft-com:vml" xmlns:wp14="http://schemas.microsoft.com/office/word/2010/wordprocessingDrawing" xmlns:wp="http://schemas.openxmlformats.org/drawingml/2006/wordprocessingDrawing" xmlns:w10="urn:schemas-microsoft-com:office:word" xmlns:w="http://schemas.openxmlformats.org/wordprocessingml/2006/main" xmlns:w14="http://schemas.microsoft.com/office/word/2010/wordml" xmlns:w15="http://schemas.microsoft.com/office/word/2012/wordml" xmlns:w16cex="http://schemas.microsoft.com/office/word/2018/wordml/cex" xmlns:w16cid="http://schemas.microsoft.com/office/word/2016/wordml/cid" xmlns:w16="http://schemas.microsoft.com/office/word/2018/wordml" xmlns:w16du="http://schemas.microsoft.com/office/word/2023/wordml/word16du" xmlns:w16sdtdh="http://schemas.microsoft.com/office/word/2020/wordml/sdtdatahash" xmlns:w16se="http://schemas.microsoft.com/office/word/2015/wordml/symex" xmlns:wpg="http://schemas.microsoft.com/office/word/2010/wordprocessingGroup" xmlns:wpi="http://schemas.microsoft.com/office/word/2010/wordprocessingInk" xmlns:wne="http://schemas.microsoft.com/office/word/2006/wordml" xmlns:wps="http://schemas.microsoft.com/office/word/2010/wordprocessingShape" mc:Ignorable="w14 w15 w16se w16cid w16 w16cex w16sdtdh w16du wp14">
+<w:numbering xmlns:wpc="http://schemas.microsoft.com/office/word/2010/wordprocessingCanvas" xmlns:cx="http://schemas.microsoft.com/office/drawing/2014/chartex" xmlns:cx1="http://schemas.microsoft.com/office/drawing/2015/9/8/chartex" xmlns:cx2="http://schemas.microsoft.com/office/drawing/2015/10/21/chartex" xmlns:cx3="http://schemas.microsoft.com/office/drawing/2016/5/9/chartex" xmlns:cx4="http://schemas.microsoft.com/office/drawing/2016/5/10/chartex" xmlns:cx5="http://schemas.microsoft.com/office/drawing/2016/5/11/chartex" xmlns:cx6="http://schemas.microsoft.com/office/drawing/2016/5/12/chartex" xmlns:cx7="http://schemas.microsoft.com/office/drawing/2016/5/13/chartex" xmlns:cx8="http://schemas.microsoft.com/office/drawing/2016/5/14/chartex" xmlns:mc="http://schemas.openxmlformats.org/markup-compatibility/2006" xmlns:aink="http://schemas.microsoft.com/office/drawing/2016/ink" xmlns:am3d="http://schemas.microsoft.com/office/drawing/2017/model3d" xmlns:o="urn:schemas-microsoft-com:office:office" xmlns:oel="http://schemas.microsoft.com/office/2019/extlst" xmlns:r="http://schemas.openxmlformats.org/officeDocument/2006/relationships" xmlns:m="http://schemas.openxmlformats.org/officeDocument/2006/math" xmlns:v="urn:schemas-microsoft-com:vml" xmlns:wp14="http://schemas.microsoft.com/office/word/2010/wordprocessingDrawing" xmlns:wp="http://schemas.openxmlformats.org/drawingml/2006/wordprocessingDrawing" xmlns:w10="urn:schemas-microsoft-com:office:word" xmlns:w="http://schemas.openxmlformats.org/wordprocessingml/2006/main" xmlns:w14="http://schemas.microsoft.com/office/word/2010/wordml" xmlns:w15="http://schemas.microsoft.com/office/word/2012/wordml" xmlns:w16cex="http://schemas.microsoft.com/office/word/2018/wordml/cex" xmlns:w16cid="http://schemas.microsoft.com/office/word/2016/wordml/cid" xmlns:w16="http://schemas.microsoft.com/office/word/2018/wordml" xmlns:w16du="http://schemas.microsoft.com/office/word/2023/wordml/word16du" xmlns:w16sdtdh="http://schemas.microsoft.com/office/word/2020/wordml/sdtdatahash" xmlns:w16sdtfl="http://schemas.microsoft.com/office/word/2024/wordml/sdtformatlock" xmlns:w16se="http://schemas.microsoft.com/office/word/2015/wordml/symex" xmlns:wpg="http://schemas.microsoft.com/office/word/2010/wordprocessingGroup" xmlns:wpi="http://schemas.microsoft.com/office/word/2010/wordprocessingInk" xmlns:wne="http://schemas.microsoft.com/office/word/2006/wordml" xmlns:wps="http://schemas.microsoft.com/office/word/2010/wordprocessingShape" mc:Ignorable="w14 w15 w16se w16cid w16 w16cex w16sdtdh w16sdtfl w16du wp14">
   <w:abstractNum w:abstractNumId="0" w15:restartNumberingAfterBreak="0">
     <w:nsid w:val="0CFE0E25"/>
     <w:multiLevelType w:val="hybridMultilevel"/>
@@ -1913,7 +2015,7 @@
 </file>
 
 <file path=word/styles.xml><?xml version="1.0" encoding="utf-8"?>
-<w:styles xmlns:mc="http://schemas.openxmlformats.org/markup-compatibility/2006" xmlns:r="http://schemas.openxmlformats.org/officeDocument/2006/relationships" xmlns:w="http://schemas.openxmlformats.org/wordprocessingml/2006/main" xmlns:w14="http://schemas.microsoft.com/office/word/2010/wordml" xmlns:w15="http://schemas.microsoft.com/office/word/2012/wordml" xmlns:w16cex="http://schemas.microsoft.com/office/word/2018/wordml/cex" xmlns:w16cid="http://schemas.microsoft.com/office/word/2016/wordml/cid" xmlns:w16="http://schemas.microsoft.com/office/word/2018/wordml" xmlns:w16du="http://schemas.microsoft.com/office/word/2023/wordml/word16du" xmlns:w16sdtdh="http://schemas.microsoft.com/office/word/2020/wordml/sdtdatahash" xmlns:w16se="http://schemas.microsoft.com/office/word/2015/wordml/symex" mc:Ignorable="w14 w15 w16se w16cid w16 w16cex w16sdtdh w16du">
+<w:styles xmlns:mc="http://schemas.openxmlformats.org/markup-compatibility/2006" xmlns:r="http://schemas.openxmlformats.org/officeDocument/2006/relationships" xmlns:w="http://schemas.openxmlformats.org/wordprocessingml/2006/main" xmlns:w14="http://schemas.microsoft.com/office/word/2010/wordml" xmlns:w15="http://schemas.microsoft.com/office/word/2012/wordml" xmlns:w16cex="http://schemas.microsoft.com/office/word/2018/wordml/cex" xmlns:w16cid="http://schemas.microsoft.com/office/word/2016/wordml/cid" xmlns:w16="http://schemas.microsoft.com/office/word/2018/wordml" xmlns:w16du="http://schemas.microsoft.com/office/word/2023/wordml/word16du" xmlns:w16sdtdh="http://schemas.microsoft.com/office/word/2020/wordml/sdtdatahash" xmlns:w16sdtfl="http://schemas.microsoft.com/office/word/2024/wordml/sdtformatlock" xmlns:w16se="http://schemas.microsoft.com/office/word/2015/wordml/symex" mc:Ignorable="w14 w15 w16se w16cid w16 w16cex w16sdtdh w16sdtfl w16du">
   <w:docDefaults>
     <w:rPrDefault>
       <w:rPr>

</xml_diff>